<commit_message>
docs(supplementary): update Supplementary Material docx and md with all 6 tables and harmonized notation
</commit_message>
<xml_diff>
--- a/results/submission_package/Supplementary_Material.docx
+++ b/results/submission_package/Supplementary_Material.docx
@@ -21,7 +21,9 @@
           <w:i/>
           <w:sz w:val="21"/>
         </w:rPr>
-        <w:t>Evaluating Demographic Disparities in Clinical Risk Prediction: A Structural Fairness and Mixture-of-Experts Investigation</w:t>
+        <w:t>When architecture is not a fairness remedy: a utility-matched evaluation of cluster-then-predict pipelines for diabetes risk prediction</w:t>
+        <w:br/>
+        <w:t>Authors: Ardhian Ekawijana, Mochamad Teguh Kurniawan, Sugeng Rifqi Mubaroq (2026)</w:t>
         <w:br/>
         <w:t>Dataset: CDC BRFSS 2015 (N = 253,680)</w:t>
       </w:r>
@@ -31,12 +33,12 @@
         <w:pStyle w:val="Heading2"/>
       </w:pPr>
       <w:r>
-        <w:t>Section S1: Sensitivity Analysis over Fairness Regularization Parameter (λ_fairness)</w:t>
+        <w:t>Section S1: Sensitivity Analysis over Fairness Regularization Parameter (λ)</w:t>
       </w:r>
     </w:p>
     <w:p>
       <w:r>
-        <w:t>Table S1 shows the sensitivity sweep across two orders of magnitude in λ_fairness on CDC BRFSS 2015.</w:t>
+        <w:t>Table S1 shows the sensitivity sweep across two orders of magnitude in λ on CDC BRFSS 2015.</w:t>
       </w:r>
     </w:p>
     <w:tbl>
@@ -67,7 +69,7 @@
                 <w:b/>
                 <w:sz w:val="19"/>
               </w:rPr>
-              <w:t>λ_fair</w:t>
+              <w:t>λ</w:t>
             </w:r>
           </w:p>
         </w:tc>
@@ -2162,6 +2164,1339 @@
         </w:tc>
       </w:tr>
     </w:tbl>
+    <w:p>
+      <w:pPr>
+        <w:pStyle w:val="Heading2"/>
+      </w:pPr>
+      <w:r>
+        <w:t>Section S4: Standardized Statistical Inference Protocol (B = 2,000 Paired Bootstrap)</w:t>
+      </w:r>
+    </w:p>
+    <w:p>
+      <w:r>
+        <w:t>Details of the 4-strata (Y, S) paired bootstrap resampling protocol and percentile confidence interval estimation.</w:t>
+      </w:r>
+    </w:p>
+    <w:p>
+      <w:pPr>
+        <w:pStyle w:val="Heading2"/>
+      </w:pPr>
+      <w:r>
+        <w:t>Section S5: Harmonized Clinical Operating Point Benchmark (pt = 0.10)</w:t>
+      </w:r>
+    </w:p>
+    <w:p>
+      <w:r>
+        <w:t>Table S4 evaluates statistical fairness and clinical net benefit at the uniform decision threshold pt = 0.10.</w:t>
+      </w:r>
+    </w:p>
+    <w:tbl>
+      <w:tblPr>
+        <w:tblW w:type="auto" w:w="0"/>
+        <w:jc w:val="center"/>
+        <w:tblLook w:firstColumn="1" w:firstRow="1" w:lastColumn="0" w:lastRow="0" w:noHBand="0" w:noVBand="1" w:val="04A0"/>
+      </w:tblPr>
+      <w:tblGrid>
+        <w:gridCol w:w="1234"/>
+        <w:gridCol w:w="1234"/>
+        <w:gridCol w:w="1234"/>
+        <w:gridCol w:w="1234"/>
+        <w:gridCol w:w="1234"/>
+        <w:gridCol w:w="1234"/>
+        <w:gridCol w:w="1234"/>
+      </w:tblGrid>
+      <w:tr>
+        <w:tc>
+          <w:tcPr>
+            <w:tcW w:type="dxa" w:w="1234"/>
+          </w:tcPr>
+          <w:p>
+            <w:r>
+              <w:rPr>
+                <w:b/>
+                <w:sz w:val="19"/>
+              </w:rPr>
+              <w:t>Architecture</w:t>
+            </w:r>
+          </w:p>
+        </w:tc>
+        <w:tc>
+          <w:tcPr>
+            <w:tcW w:type="dxa" w:w="1234"/>
+          </w:tcPr>
+          <w:p>
+            <w:r>
+              <w:rPr>
+                <w:b/>
+                <w:sz w:val="19"/>
+              </w:rPr>
+              <w:t>AUC</w:t>
+            </w:r>
+          </w:p>
+        </w:tc>
+        <w:tc>
+          <w:tcPr>
+            <w:tcW w:type="dxa" w:w="1234"/>
+          </w:tcPr>
+          <w:p>
+            <w:r>
+              <w:rPr>
+                <w:b/>
+                <w:sz w:val="19"/>
+              </w:rPr>
+              <w:t>Net Benefit (pt=0.10)</w:t>
+            </w:r>
+          </w:p>
+        </w:tc>
+        <w:tc>
+          <w:tcPr>
+            <w:tcW w:type="dxa" w:w="1234"/>
+          </w:tcPr>
+          <w:p>
+            <w:r>
+              <w:rPr>
+                <w:b/>
+                <w:sz w:val="19"/>
+              </w:rPr>
+              <w:t>DPD</w:t>
+            </w:r>
+          </w:p>
+        </w:tc>
+        <w:tc>
+          <w:tcPr>
+            <w:tcW w:type="dxa" w:w="1234"/>
+          </w:tcPr>
+          <w:p>
+            <w:r>
+              <w:rPr>
+                <w:b/>
+                <w:sz w:val="19"/>
+              </w:rPr>
+              <w:t>DPR</w:t>
+            </w:r>
+          </w:p>
+        </w:tc>
+        <w:tc>
+          <w:tcPr>
+            <w:tcW w:type="dxa" w:w="1234"/>
+          </w:tcPr>
+          <w:p>
+            <w:r>
+              <w:rPr>
+                <w:b/>
+                <w:sz w:val="19"/>
+              </w:rPr>
+              <w:t>EOD</w:t>
+            </w:r>
+          </w:p>
+        </w:tc>
+        <w:tc>
+          <w:tcPr>
+            <w:tcW w:type="dxa" w:w="1234"/>
+          </w:tcPr>
+          <w:p>
+            <w:r>
+              <w:rPr>
+                <w:b/>
+                <w:sz w:val="19"/>
+              </w:rPr>
+              <w:t>Balanced Acc (%)</w:t>
+            </w:r>
+          </w:p>
+        </w:tc>
+      </w:tr>
+      <w:tr>
+        <w:tc>
+          <w:tcPr>
+            <w:tcW w:type="dxa" w:w="1234"/>
+          </w:tcPr>
+          <w:p>
+            <w:r>
+              <w:rPr>
+                <w:sz w:val="18"/>
+              </w:rPr>
+              <w:t>Single LightGBM (Baseline)</w:t>
+            </w:r>
+          </w:p>
+        </w:tc>
+        <w:tc>
+          <w:tcPr>
+            <w:tcW w:type="dxa" w:w="1234"/>
+          </w:tcPr>
+          <w:p>
+            <w:r>
+              <w:rPr>
+                <w:sz w:val="18"/>
+              </w:rPr>
+              <w:t>0.8263</w:t>
+            </w:r>
+          </w:p>
+        </w:tc>
+        <w:tc>
+          <w:tcPr>
+            <w:tcW w:type="dxa" w:w="1234"/>
+          </w:tcPr>
+          <w:p>
+            <w:r>
+              <w:rPr>
+                <w:sz w:val="18"/>
+              </w:rPr>
+              <w:t>0.0847</w:t>
+            </w:r>
+          </w:p>
+        </w:tc>
+        <w:tc>
+          <w:tcPr>
+            <w:tcW w:type="dxa" w:w="1234"/>
+          </w:tcPr>
+          <w:p>
+            <w:r>
+              <w:rPr>
+                <w:sz w:val="18"/>
+              </w:rPr>
+              <w:t>0.2842</w:t>
+            </w:r>
+          </w:p>
+        </w:tc>
+        <w:tc>
+          <w:tcPr>
+            <w:tcW w:type="dxa" w:w="1234"/>
+          </w:tcPr>
+          <w:p>
+            <w:r>
+              <w:rPr>
+                <w:sz w:val="18"/>
+              </w:rPr>
+              <w:t>0.5730</w:t>
+            </w:r>
+          </w:p>
+        </w:tc>
+        <w:tc>
+          <w:tcPr>
+            <w:tcW w:type="dxa" w:w="1234"/>
+          </w:tcPr>
+          <w:p>
+            <w:r>
+              <w:rPr>
+                <w:sz w:val="18"/>
+              </w:rPr>
+              <w:t>0.2620</w:t>
+            </w:r>
+          </w:p>
+        </w:tc>
+        <w:tc>
+          <w:tcPr>
+            <w:tcW w:type="dxa" w:w="1234"/>
+          </w:tcPr>
+          <w:p>
+            <w:r>
+              <w:rPr>
+                <w:sz w:val="18"/>
+              </w:rPr>
+              <w:t>74.50</w:t>
+            </w:r>
+          </w:p>
+        </w:tc>
+      </w:tr>
+      <w:tr>
+        <w:tc>
+          <w:tcPr>
+            <w:tcW w:type="dxa" w:w="1234"/>
+          </w:tcPr>
+          <w:p>
+            <w:r>
+              <w:rPr>
+                <w:sz w:val="18"/>
+              </w:rPr>
+              <w:t>Pre-Processing Reweighing</w:t>
+            </w:r>
+          </w:p>
+        </w:tc>
+        <w:tc>
+          <w:tcPr>
+            <w:tcW w:type="dxa" w:w="1234"/>
+          </w:tcPr>
+          <w:p>
+            <w:r>
+              <w:rPr>
+                <w:sz w:val="18"/>
+              </w:rPr>
+              <w:t>0.8162</w:t>
+            </w:r>
+          </w:p>
+        </w:tc>
+        <w:tc>
+          <w:tcPr>
+            <w:tcW w:type="dxa" w:w="1234"/>
+          </w:tcPr>
+          <w:p>
+            <w:r>
+              <w:rPr>
+                <w:sz w:val="18"/>
+              </w:rPr>
+              <w:t>0.0834</w:t>
+            </w:r>
+          </w:p>
+        </w:tc>
+        <w:tc>
+          <w:tcPr>
+            <w:tcW w:type="dxa" w:w="1234"/>
+          </w:tcPr>
+          <w:p>
+            <w:r>
+              <w:rPr>
+                <w:sz w:val="18"/>
+              </w:rPr>
+              <w:t>0.1386</w:t>
+            </w:r>
+          </w:p>
+        </w:tc>
+        <w:tc>
+          <w:tcPr>
+            <w:tcW w:type="dxa" w:w="1234"/>
+          </w:tcPr>
+          <w:p>
+            <w:r>
+              <w:rPr>
+                <w:sz w:val="18"/>
+              </w:rPr>
+              <w:t>0.7528</w:t>
+            </w:r>
+          </w:p>
+        </w:tc>
+        <w:tc>
+          <w:tcPr>
+            <w:tcW w:type="dxa" w:w="1234"/>
+          </w:tcPr>
+          <w:p>
+            <w:r>
+              <w:rPr>
+                <w:sz w:val="18"/>
+              </w:rPr>
+              <w:t>0.1036</w:t>
+            </w:r>
+          </w:p>
+        </w:tc>
+        <w:tc>
+          <w:tcPr>
+            <w:tcW w:type="dxa" w:w="1234"/>
+          </w:tcPr>
+          <w:p>
+            <w:r>
+              <w:rPr>
+                <w:sz w:val="18"/>
+              </w:rPr>
+              <w:t>73.86</w:t>
+            </w:r>
+          </w:p>
+        </w:tc>
+      </w:tr>
+      <w:tr>
+        <w:tc>
+          <w:tcPr>
+            <w:tcW w:type="dxa" w:w="1234"/>
+          </w:tcPr>
+          <w:p>
+            <w:r>
+              <w:rPr>
+                <w:sz w:val="18"/>
+              </w:rPr>
+              <w:t>In-Processing (ExpGrad-DP)</w:t>
+            </w:r>
+          </w:p>
+        </w:tc>
+        <w:tc>
+          <w:tcPr>
+            <w:tcW w:type="dxa" w:w="1234"/>
+          </w:tcPr>
+          <w:p>
+            <w:r>
+              <w:rPr>
+                <w:sz w:val="18"/>
+              </w:rPr>
+              <w:t>0.5564</w:t>
+            </w:r>
+          </w:p>
+        </w:tc>
+        <w:tc>
+          <w:tcPr>
+            <w:tcW w:type="dxa" w:w="1234"/>
+          </w:tcPr>
+          <w:p>
+            <w:r>
+              <w:rPr>
+                <w:sz w:val="18"/>
+              </w:rPr>
+              <w:t>0.0164</w:t>
+            </w:r>
+          </w:p>
+        </w:tc>
+        <w:tc>
+          <w:tcPr>
+            <w:tcW w:type="dxa" w:w="1234"/>
+          </w:tcPr>
+          <w:p>
+            <w:r>
+              <w:rPr>
+                <w:sz w:val="18"/>
+              </w:rPr>
+              <w:t>0.0118</w:t>
+            </w:r>
+          </w:p>
+        </w:tc>
+        <w:tc>
+          <w:tcPr>
+            <w:tcW w:type="dxa" w:w="1234"/>
+          </w:tcPr>
+          <w:p>
+            <w:r>
+              <w:rPr>
+                <w:sz w:val="18"/>
+              </w:rPr>
+              <w:t>0.7098</w:t>
+            </w:r>
+          </w:p>
+        </w:tc>
+        <w:tc>
+          <w:tcPr>
+            <w:tcW w:type="dxa" w:w="1234"/>
+          </w:tcPr>
+          <w:p>
+            <w:r>
+              <w:rPr>
+                <w:sz w:val="18"/>
+              </w:rPr>
+              <w:t>0.0252</w:t>
+            </w:r>
+          </w:p>
+        </w:tc>
+        <w:tc>
+          <w:tcPr>
+            <w:tcW w:type="dxa" w:w="1234"/>
+          </w:tcPr>
+          <w:p>
+            <w:r>
+              <w:rPr>
+                <w:sz w:val="18"/>
+              </w:rPr>
+              <w:t>55.64</w:t>
+            </w:r>
+          </w:p>
+        </w:tc>
+      </w:tr>
+      <w:tr>
+        <w:tc>
+          <w:tcPr>
+            <w:tcW w:type="dxa" w:w="1234"/>
+          </w:tcPr>
+          <w:p>
+            <w:r>
+              <w:rPr>
+                <w:sz w:val="18"/>
+              </w:rPr>
+              <w:t>Hard Partitioning (HP, K=2)</w:t>
+            </w:r>
+          </w:p>
+        </w:tc>
+        <w:tc>
+          <w:tcPr>
+            <w:tcW w:type="dxa" w:w="1234"/>
+          </w:tcPr>
+          <w:p>
+            <w:r>
+              <w:rPr>
+                <w:sz w:val="18"/>
+              </w:rPr>
+              <w:t>0.7022</w:t>
+            </w:r>
+          </w:p>
+        </w:tc>
+        <w:tc>
+          <w:tcPr>
+            <w:tcW w:type="dxa" w:w="1234"/>
+          </w:tcPr>
+          <w:p>
+            <w:r>
+              <w:rPr>
+                <w:sz w:val="18"/>
+              </w:rPr>
+              <w:t>0.0637</w:t>
+            </w:r>
+          </w:p>
+        </w:tc>
+        <w:tc>
+          <w:tcPr>
+            <w:tcW w:type="dxa" w:w="1234"/>
+          </w:tcPr>
+          <w:p>
+            <w:r>
+              <w:rPr>
+                <w:sz w:val="18"/>
+              </w:rPr>
+              <w:t>0.1019</w:t>
+            </w:r>
+          </w:p>
+        </w:tc>
+        <w:tc>
+          <w:tcPr>
+            <w:tcW w:type="dxa" w:w="1234"/>
+          </w:tcPr>
+          <w:p>
+            <w:r>
+              <w:rPr>
+                <w:sz w:val="18"/>
+              </w:rPr>
+              <w:t>0.8838</w:t>
+            </w:r>
+          </w:p>
+        </w:tc>
+        <w:tc>
+          <w:tcPr>
+            <w:tcW w:type="dxa" w:w="1234"/>
+          </w:tcPr>
+          <w:p>
+            <w:r>
+              <w:rPr>
+                <w:sz w:val="18"/>
+              </w:rPr>
+              <w:t>0.0974</w:t>
+            </w:r>
+          </w:p>
+        </w:tc>
+        <w:tc>
+          <w:tcPr>
+            <w:tcW w:type="dxa" w:w="1234"/>
+          </w:tcPr>
+          <w:p>
+            <w:r>
+              <w:rPr>
+                <w:sz w:val="18"/>
+              </w:rPr>
+              <w:t>60.80</w:t>
+            </w:r>
+          </w:p>
+        </w:tc>
+      </w:tr>
+      <w:tr>
+        <w:tc>
+          <w:tcPr>
+            <w:tcW w:type="dxa" w:w="1234"/>
+          </w:tcPr>
+          <w:p>
+            <w:r>
+              <w:rPr>
+                <w:sz w:val="18"/>
+              </w:rPr>
+              <w:t>Hierarchical MoE (HMoE, K=2)</w:t>
+            </w:r>
+          </w:p>
+        </w:tc>
+        <w:tc>
+          <w:tcPr>
+            <w:tcW w:type="dxa" w:w="1234"/>
+          </w:tcPr>
+          <w:p>
+            <w:r>
+              <w:rPr>
+                <w:sz w:val="18"/>
+              </w:rPr>
+              <w:t>0.8261</w:t>
+            </w:r>
+          </w:p>
+        </w:tc>
+        <w:tc>
+          <w:tcPr>
+            <w:tcW w:type="dxa" w:w="1234"/>
+          </w:tcPr>
+          <w:p>
+            <w:r>
+              <w:rPr>
+                <w:sz w:val="18"/>
+              </w:rPr>
+              <w:t>0.0849</w:t>
+            </w:r>
+          </w:p>
+        </w:tc>
+        <w:tc>
+          <w:tcPr>
+            <w:tcW w:type="dxa" w:w="1234"/>
+          </w:tcPr>
+          <w:p>
+            <w:r>
+              <w:rPr>
+                <w:sz w:val="18"/>
+              </w:rPr>
+              <w:t>0.2952</w:t>
+            </w:r>
+          </w:p>
+        </w:tc>
+        <w:tc>
+          <w:tcPr>
+            <w:tcW w:type="dxa" w:w="1234"/>
+          </w:tcPr>
+          <w:p>
+            <w:r>
+              <w:rPr>
+                <w:sz w:val="18"/>
+              </w:rPr>
+              <w:t>0.5667</w:t>
+            </w:r>
+          </w:p>
+        </w:tc>
+        <w:tc>
+          <w:tcPr>
+            <w:tcW w:type="dxa" w:w="1234"/>
+          </w:tcPr>
+          <w:p>
+            <w:r>
+              <w:rPr>
+                <w:sz w:val="18"/>
+              </w:rPr>
+              <w:t>0.2754</w:t>
+            </w:r>
+          </w:p>
+        </w:tc>
+        <w:tc>
+          <w:tcPr>
+            <w:tcW w:type="dxa" w:w="1234"/>
+          </w:tcPr>
+          <w:p>
+            <w:r>
+              <w:rPr>
+                <w:sz w:val="18"/>
+              </w:rPr>
+              <w:t>74.45</w:t>
+            </w:r>
+          </w:p>
+        </w:tc>
+      </w:tr>
+      <w:tr>
+        <w:tc>
+          <w:tcPr>
+            <w:tcW w:type="dxa" w:w="1234"/>
+          </w:tcPr>
+          <w:p>
+            <w:r>
+              <w:rPr>
+                <w:sz w:val="18"/>
+              </w:rPr>
+              <w:t>Threshold Optimizer (Post)</w:t>
+            </w:r>
+          </w:p>
+        </w:tc>
+        <w:tc>
+          <w:tcPr>
+            <w:tcW w:type="dxa" w:w="1234"/>
+          </w:tcPr>
+          <w:p>
+            <w:r>
+              <w:rPr>
+                <w:sz w:val="18"/>
+              </w:rPr>
+              <w:t>0.8263</w:t>
+            </w:r>
+          </w:p>
+        </w:tc>
+        <w:tc>
+          <w:tcPr>
+            <w:tcW w:type="dxa" w:w="1234"/>
+          </w:tcPr>
+          <w:p>
+            <w:r>
+              <w:rPr>
+                <w:sz w:val="18"/>
+              </w:rPr>
+              <w:t>0.0743</w:t>
+            </w:r>
+          </w:p>
+        </w:tc>
+        <w:tc>
+          <w:tcPr>
+            <w:tcW w:type="dxa" w:w="1234"/>
+          </w:tcPr>
+          <w:p>
+            <w:r>
+              <w:rPr>
+                <w:sz w:val="18"/>
+              </w:rPr>
+              <w:t>0.0470</w:t>
+            </w:r>
+          </w:p>
+        </w:tc>
+        <w:tc>
+          <w:tcPr>
+            <w:tcW w:type="dxa" w:w="1234"/>
+          </w:tcPr>
+          <w:p>
+            <w:r>
+              <w:rPr>
+                <w:sz w:val="18"/>
+              </w:rPr>
+              <w:t>0.8912</w:t>
+            </w:r>
+          </w:p>
+        </w:tc>
+        <w:tc>
+          <w:tcPr>
+            <w:tcW w:type="dxa" w:w="1234"/>
+          </w:tcPr>
+          <w:p>
+            <w:r>
+              <w:rPr>
+                <w:sz w:val="18"/>
+              </w:rPr>
+              <w:t>0.0036</w:t>
+            </w:r>
+          </w:p>
+        </w:tc>
+        <w:tc>
+          <w:tcPr>
+            <w:tcW w:type="dxa" w:w="1234"/>
+          </w:tcPr>
+          <w:p>
+            <w:r>
+              <w:rPr>
+                <w:sz w:val="18"/>
+              </w:rPr>
+              <w:t>71.39</w:t>
+            </w:r>
+          </w:p>
+        </w:tc>
+      </w:tr>
+    </w:tbl>
+    <w:p>
+      <w:pPr>
+        <w:pStyle w:val="Heading2"/>
+      </w:pPr>
+      <w:r>
+        <w:t>Section S6: Candidate Search Spaces (Standard N=18 &amp; Scaled N=105)</w:t>
+      </w:r>
+    </w:p>
+    <w:p>
+      <w:r>
+        <w:t>Table S5 shows the full enumeration of the standard candidate space (N=18).</w:t>
+      </w:r>
+    </w:p>
+    <w:tbl>
+      <w:tblPr>
+        <w:tblW w:type="auto" w:w="0"/>
+        <w:jc w:val="center"/>
+        <w:tblLook w:firstColumn="1" w:firstRow="1" w:lastColumn="0" w:lastRow="0" w:noHBand="0" w:noVBand="1" w:val="04A0"/>
+      </w:tblPr>
+      <w:tblGrid>
+        <w:gridCol w:w="2160"/>
+        <w:gridCol w:w="2160"/>
+        <w:gridCol w:w="2160"/>
+        <w:gridCol w:w="2160"/>
+      </w:tblGrid>
+      <w:tr>
+        <w:tc>
+          <w:tcPr>
+            <w:tcW w:type="dxa" w:w="2160"/>
+          </w:tcPr>
+          <w:p>
+            <w:r>
+              <w:rPr>
+                <w:b/>
+                <w:sz w:val="19"/>
+              </w:rPr>
+              <w:t>Config ID</w:t>
+            </w:r>
+          </w:p>
+        </w:tc>
+        <w:tc>
+          <w:tcPr>
+            <w:tcW w:type="dxa" w:w="2160"/>
+          </w:tcPr>
+          <w:p>
+            <w:r>
+              <w:rPr>
+                <w:b/>
+                <w:sz w:val="19"/>
+              </w:rPr>
+              <w:t>Candidate K</w:t>
+            </w:r>
+          </w:p>
+        </w:tc>
+        <w:tc>
+          <w:tcPr>
+            <w:tcW w:type="dxa" w:w="2160"/>
+          </w:tcPr>
+          <w:p>
+            <w:r>
+              <w:rPr>
+                <w:b/>
+                <w:sz w:val="19"/>
+              </w:rPr>
+              <w:t>Clustering Method</w:t>
+            </w:r>
+          </w:p>
+        </w:tc>
+        <w:tc>
+          <w:tcPr>
+            <w:tcW w:type="dxa" w:w="2160"/>
+          </w:tcPr>
+          <w:p>
+            <w:r>
+              <w:rPr>
+                <w:b/>
+                <w:sz w:val="19"/>
+              </w:rPr>
+              <w:t>Classifier Family</w:t>
+            </w:r>
+          </w:p>
+        </w:tc>
+      </w:tr>
+      <w:tr>
+        <w:tc>
+          <w:tcPr>
+            <w:tcW w:type="dxa" w:w="2160"/>
+          </w:tcPr>
+          <w:p>
+            <w:r>
+              <w:rPr>
+                <w:sz w:val="18"/>
+              </w:rPr>
+              <w:t>1-3</w:t>
+            </w:r>
+          </w:p>
+        </w:tc>
+        <w:tc>
+          <w:tcPr>
+            <w:tcW w:type="dxa" w:w="2160"/>
+          </w:tcPr>
+          <w:p>
+            <w:r>
+              <w:rPr>
+                <w:sz w:val="18"/>
+              </w:rPr>
+              <w:t>2</w:t>
+            </w:r>
+          </w:p>
+        </w:tc>
+        <w:tc>
+          <w:tcPr>
+            <w:tcW w:type="dxa" w:w="2160"/>
+          </w:tcPr>
+          <w:p>
+            <w:r>
+              <w:rPr>
+                <w:sz w:val="18"/>
+              </w:rPr>
+              <w:t>KMeans</w:t>
+            </w:r>
+          </w:p>
+        </w:tc>
+        <w:tc>
+          <w:tcPr>
+            <w:tcW w:type="dxa" w:w="2160"/>
+          </w:tcPr>
+          <w:p>
+            <w:r>
+              <w:rPr>
+                <w:sz w:val="18"/>
+              </w:rPr>
+              <w:t>Adaptive / LightGBM / Logistic Regression</w:t>
+            </w:r>
+          </w:p>
+        </w:tc>
+      </w:tr>
+      <w:tr>
+        <w:tc>
+          <w:tcPr>
+            <w:tcW w:type="dxa" w:w="2160"/>
+          </w:tcPr>
+          <w:p>
+            <w:r>
+              <w:rPr>
+                <w:sz w:val="18"/>
+              </w:rPr>
+              <w:t>4-6</w:t>
+            </w:r>
+          </w:p>
+        </w:tc>
+        <w:tc>
+          <w:tcPr>
+            <w:tcW w:type="dxa" w:w="2160"/>
+          </w:tcPr>
+          <w:p>
+            <w:r>
+              <w:rPr>
+                <w:sz w:val="18"/>
+              </w:rPr>
+              <w:t>2</w:t>
+            </w:r>
+          </w:p>
+        </w:tc>
+        <w:tc>
+          <w:tcPr>
+            <w:tcW w:type="dxa" w:w="2160"/>
+          </w:tcPr>
+          <w:p>
+            <w:r>
+              <w:rPr>
+                <w:sz w:val="18"/>
+              </w:rPr>
+              <w:t>Auto (Silhouette-Adaptive)</w:t>
+            </w:r>
+          </w:p>
+        </w:tc>
+        <w:tc>
+          <w:tcPr>
+            <w:tcW w:type="dxa" w:w="2160"/>
+          </w:tcPr>
+          <w:p>
+            <w:r>
+              <w:rPr>
+                <w:sz w:val="18"/>
+              </w:rPr>
+              <w:t>Adaptive / LightGBM / Logistic Regression</w:t>
+            </w:r>
+          </w:p>
+        </w:tc>
+      </w:tr>
+      <w:tr>
+        <w:tc>
+          <w:tcPr>
+            <w:tcW w:type="dxa" w:w="2160"/>
+          </w:tcPr>
+          <w:p>
+            <w:r>
+              <w:rPr>
+                <w:sz w:val="18"/>
+              </w:rPr>
+              <w:t>7-9</w:t>
+            </w:r>
+          </w:p>
+        </w:tc>
+        <w:tc>
+          <w:tcPr>
+            <w:tcW w:type="dxa" w:w="2160"/>
+          </w:tcPr>
+          <w:p>
+            <w:r>
+              <w:rPr>
+                <w:sz w:val="18"/>
+              </w:rPr>
+              <w:t>4</w:t>
+            </w:r>
+          </w:p>
+        </w:tc>
+        <w:tc>
+          <w:tcPr>
+            <w:tcW w:type="dxa" w:w="2160"/>
+          </w:tcPr>
+          <w:p>
+            <w:r>
+              <w:rPr>
+                <w:sz w:val="18"/>
+              </w:rPr>
+              <w:t>KMeans</w:t>
+            </w:r>
+          </w:p>
+        </w:tc>
+        <w:tc>
+          <w:tcPr>
+            <w:tcW w:type="dxa" w:w="2160"/>
+          </w:tcPr>
+          <w:p>
+            <w:r>
+              <w:rPr>
+                <w:sz w:val="18"/>
+              </w:rPr>
+              <w:t>Adaptive / LightGBM / Logistic Regression</w:t>
+            </w:r>
+          </w:p>
+        </w:tc>
+      </w:tr>
+      <w:tr>
+        <w:tc>
+          <w:tcPr>
+            <w:tcW w:type="dxa" w:w="2160"/>
+          </w:tcPr>
+          <w:p>
+            <w:r>
+              <w:rPr>
+                <w:sz w:val="18"/>
+              </w:rPr>
+              <w:t>10-12</w:t>
+            </w:r>
+          </w:p>
+        </w:tc>
+        <w:tc>
+          <w:tcPr>
+            <w:tcW w:type="dxa" w:w="2160"/>
+          </w:tcPr>
+          <w:p>
+            <w:r>
+              <w:rPr>
+                <w:sz w:val="18"/>
+              </w:rPr>
+              <w:t>4</w:t>
+            </w:r>
+          </w:p>
+        </w:tc>
+        <w:tc>
+          <w:tcPr>
+            <w:tcW w:type="dxa" w:w="2160"/>
+          </w:tcPr>
+          <w:p>
+            <w:r>
+              <w:rPr>
+                <w:sz w:val="18"/>
+              </w:rPr>
+              <w:t>Auto (Silhouette-Adaptive)</w:t>
+            </w:r>
+          </w:p>
+        </w:tc>
+        <w:tc>
+          <w:tcPr>
+            <w:tcW w:type="dxa" w:w="2160"/>
+          </w:tcPr>
+          <w:p>
+            <w:r>
+              <w:rPr>
+                <w:sz w:val="18"/>
+              </w:rPr>
+              <w:t>Adaptive / LightGBM / Logistic Regression</w:t>
+            </w:r>
+          </w:p>
+        </w:tc>
+      </w:tr>
+      <w:tr>
+        <w:tc>
+          <w:tcPr>
+            <w:tcW w:type="dxa" w:w="2160"/>
+          </w:tcPr>
+          <w:p>
+            <w:r>
+              <w:rPr>
+                <w:sz w:val="18"/>
+              </w:rPr>
+              <w:t>13-15</w:t>
+            </w:r>
+          </w:p>
+        </w:tc>
+        <w:tc>
+          <w:tcPr>
+            <w:tcW w:type="dxa" w:w="2160"/>
+          </w:tcPr>
+          <w:p>
+            <w:r>
+              <w:rPr>
+                <w:sz w:val="18"/>
+              </w:rPr>
+              <w:t>6</w:t>
+            </w:r>
+          </w:p>
+        </w:tc>
+        <w:tc>
+          <w:tcPr>
+            <w:tcW w:type="dxa" w:w="2160"/>
+          </w:tcPr>
+          <w:p>
+            <w:r>
+              <w:rPr>
+                <w:sz w:val="18"/>
+              </w:rPr>
+              <w:t>KMeans</w:t>
+            </w:r>
+          </w:p>
+        </w:tc>
+        <w:tc>
+          <w:tcPr>
+            <w:tcW w:type="dxa" w:w="2160"/>
+          </w:tcPr>
+          <w:p>
+            <w:r>
+              <w:rPr>
+                <w:sz w:val="18"/>
+              </w:rPr>
+              <w:t>Adaptive / LightGBM / Logistic Regression</w:t>
+            </w:r>
+          </w:p>
+        </w:tc>
+      </w:tr>
+      <w:tr>
+        <w:tc>
+          <w:tcPr>
+            <w:tcW w:type="dxa" w:w="2160"/>
+          </w:tcPr>
+          <w:p>
+            <w:r>
+              <w:rPr>
+                <w:sz w:val="18"/>
+              </w:rPr>
+              <w:t>16-18</w:t>
+            </w:r>
+          </w:p>
+        </w:tc>
+        <w:tc>
+          <w:tcPr>
+            <w:tcW w:type="dxa" w:w="2160"/>
+          </w:tcPr>
+          <w:p>
+            <w:r>
+              <w:rPr>
+                <w:sz w:val="18"/>
+              </w:rPr>
+              <w:t>6</w:t>
+            </w:r>
+          </w:p>
+        </w:tc>
+        <w:tc>
+          <w:tcPr>
+            <w:tcW w:type="dxa" w:w="2160"/>
+          </w:tcPr>
+          <w:p>
+            <w:r>
+              <w:rPr>
+                <w:sz w:val="18"/>
+              </w:rPr>
+              <w:t>Auto (Silhouette-Adaptive)</w:t>
+            </w:r>
+          </w:p>
+        </w:tc>
+        <w:tc>
+          <w:tcPr>
+            <w:tcW w:type="dxa" w:w="2160"/>
+          </w:tcPr>
+          <w:p>
+            <w:r>
+              <w:rPr>
+                <w:sz w:val="18"/>
+              </w:rPr>
+              <w:t>Adaptive / LightGBM / Logistic Regression</w:t>
+            </w:r>
+          </w:p>
+        </w:tc>
+      </w:tr>
+    </w:tbl>
+    <w:p>
+      <w:r>
+        <w:t>Table S6 summarizes the scaled candidate search space (N=105).</w:t>
+      </w:r>
+    </w:p>
+    <w:tbl>
+      <w:tblPr>
+        <w:tblW w:type="auto" w:w="0"/>
+        <w:jc w:val="center"/>
+        <w:tblLook w:firstColumn="1" w:firstRow="1" w:lastColumn="0" w:lastRow="0" w:noHBand="0" w:noVBand="1" w:val="04A0"/>
+      </w:tblPr>
+      <w:tblGrid>
+        <w:gridCol w:w="2880"/>
+        <w:gridCol w:w="2880"/>
+        <w:gridCol w:w="2880"/>
+      </w:tblGrid>
+      <w:tr>
+        <w:tc>
+          <w:tcPr>
+            <w:tcW w:type="dxa" w:w="2880"/>
+          </w:tcPr>
+          <w:p>
+            <w:r>
+              <w:rPr>
+                <w:b/>
+                <w:sz w:val="19"/>
+              </w:rPr>
+              <w:t>Dimension</w:t>
+            </w:r>
+          </w:p>
+        </w:tc>
+        <w:tc>
+          <w:tcPr>
+            <w:tcW w:type="dxa" w:w="2880"/>
+          </w:tcPr>
+          <w:p>
+            <w:r>
+              <w:rPr>
+                <w:b/>
+                <w:sz w:val="19"/>
+              </w:rPr>
+              <w:t>Candidate Options</w:t>
+            </w:r>
+          </w:p>
+        </w:tc>
+        <w:tc>
+          <w:tcPr>
+            <w:tcW w:type="dxa" w:w="2880"/>
+          </w:tcPr>
+          <w:p>
+            <w:r>
+              <w:rPr>
+                <w:b/>
+                <w:sz w:val="19"/>
+              </w:rPr>
+              <w:t>Count</w:t>
+            </w:r>
+          </w:p>
+        </w:tc>
+      </w:tr>
+      <w:tr>
+        <w:tc>
+          <w:tcPr>
+            <w:tcW w:type="dxa" w:w="2880"/>
+          </w:tcPr>
+          <w:p>
+            <w:r>
+              <w:rPr>
+                <w:sz w:val="18"/>
+              </w:rPr>
+              <w:t>Cluster Granularity K</w:t>
+            </w:r>
+          </w:p>
+        </w:tc>
+        <w:tc>
+          <w:tcPr>
+            <w:tcW w:type="dxa" w:w="2880"/>
+          </w:tcPr>
+          <w:p>
+            <w:r>
+              <w:rPr>
+                <w:sz w:val="18"/>
+              </w:rPr>
+              <w:t>K in {2, 3, 4, 5, 6, 8, 10}</w:t>
+            </w:r>
+          </w:p>
+        </w:tc>
+        <w:tc>
+          <w:tcPr>
+            <w:tcW w:type="dxa" w:w="2880"/>
+          </w:tcPr>
+          <w:p>
+            <w:r>
+              <w:rPr>
+                <w:sz w:val="18"/>
+              </w:rPr>
+              <w:t>7</w:t>
+            </w:r>
+          </w:p>
+        </w:tc>
+      </w:tr>
+      <w:tr>
+        <w:tc>
+          <w:tcPr>
+            <w:tcW w:type="dxa" w:w="2880"/>
+          </w:tcPr>
+          <w:p>
+            <w:r>
+              <w:rPr>
+                <w:sz w:val="18"/>
+              </w:rPr>
+              <w:t>Clustering Algorithms</w:t>
+            </w:r>
+          </w:p>
+        </w:tc>
+        <w:tc>
+          <w:tcPr>
+            <w:tcW w:type="dxa" w:w="2880"/>
+          </w:tcPr>
+          <w:p>
+            <w:r>
+              <w:rPr>
+                <w:sz w:val="18"/>
+              </w:rPr>
+              <w:t>KMeans, Auto (Adaptive), MiniBatchKMeans</w:t>
+            </w:r>
+          </w:p>
+        </w:tc>
+        <w:tc>
+          <w:tcPr>
+            <w:tcW w:type="dxa" w:w="2880"/>
+          </w:tcPr>
+          <w:p>
+            <w:r>
+              <w:rPr>
+                <w:sz w:val="18"/>
+              </w:rPr>
+              <w:t>3</w:t>
+            </w:r>
+          </w:p>
+        </w:tc>
+      </w:tr>
+      <w:tr>
+        <w:tc>
+          <w:tcPr>
+            <w:tcW w:type="dxa" w:w="2880"/>
+          </w:tcPr>
+          <w:p>
+            <w:r>
+              <w:rPr>
+                <w:sz w:val="18"/>
+              </w:rPr>
+              <w:t>Classifier Architectures</w:t>
+            </w:r>
+          </w:p>
+        </w:tc>
+        <w:tc>
+          <w:tcPr>
+            <w:tcW w:type="dxa" w:w="2880"/>
+          </w:tcPr>
+          <w:p>
+            <w:r>
+              <w:rPr>
+                <w:sz w:val="18"/>
+              </w:rPr>
+              <w:t>Adaptive, LightGBM, XGBoost, Random Forest, Logistic Regression</w:t>
+            </w:r>
+          </w:p>
+        </w:tc>
+        <w:tc>
+          <w:tcPr>
+            <w:tcW w:type="dxa" w:w="2880"/>
+          </w:tcPr>
+          <w:p>
+            <w:r>
+              <w:rPr>
+                <w:sz w:val="18"/>
+              </w:rPr>
+              <w:t>5</w:t>
+            </w:r>
+          </w:p>
+        </w:tc>
+      </w:tr>
+      <w:tr>
+        <w:tc>
+          <w:tcPr>
+            <w:tcW w:type="dxa" w:w="2880"/>
+          </w:tcPr>
+          <w:p>
+            <w:r>
+              <w:rPr>
+                <w:sz w:val="18"/>
+              </w:rPr>
+              <w:t>Total Combinations</w:t>
+            </w:r>
+          </w:p>
+        </w:tc>
+        <w:tc>
+          <w:tcPr>
+            <w:tcW w:type="dxa" w:w="2880"/>
+          </w:tcPr>
+          <w:p>
+            <w:r>
+              <w:rPr>
+                <w:sz w:val="18"/>
+              </w:rPr>
+              <w:t>7 x 3 x 5</w:t>
+            </w:r>
+          </w:p>
+        </w:tc>
+        <w:tc>
+          <w:tcPr>
+            <w:tcW w:type="dxa" w:w="2880"/>
+          </w:tcPr>
+          <w:p>
+            <w:r>
+              <w:rPr>
+                <w:sz w:val="18"/>
+              </w:rPr>
+              <w:t>105</w:t>
+            </w:r>
+          </w:p>
+        </w:tc>
+      </w:tr>
+    </w:tbl>
     <w:sectPr>
       <w:pgSz w:w="12240" w:h="15840"/>
       <w:pgMar w:top="1440" w:right="1800" w:bottom="1440" w:left="1800" w:header="720" w:footer="720" w:gutter="0"/>

</xml_diff>

<commit_message>
docs(supplementary): harmonize Table S5 (Composite-Adaptive), Table S6 (GMM), and p_t subscript notation
</commit_message>
<xml_diff>
--- a/results/submission_package/Supplementary_Material.docx
+++ b/results/submission_package/Supplementary_Material.docx
@@ -2182,7 +2182,16 @@
         <w:pStyle w:val="Heading2"/>
       </w:pPr>
       <w:r>
-        <w:t>Section S5: Harmonized Clinical Operating Point Benchmark (pt = 0.10)</w:t>
+        <w:t>Section S5: Harmonized Clinical Operating Point Benchmark (p</w:t>
+      </w:r>
+      <w:r>
+        <w:rPr>
+          <w:vertAlign w:val="subscript"/>
+        </w:rPr>
+        <w:t>t</w:t>
+      </w:r>
+      <w:r>
+        <w:t xml:space="preserve"> = 0.10)</w:t>
       </w:r>
     </w:p>
     <w:p>
@@ -3037,7 +3046,7 @@
               <w:rPr>
                 <w:sz w:val="18"/>
               </w:rPr>
-              <w:t>Auto (Silhouette-Adaptive)</w:t>
+              <w:t>Auto (Composite-Adaptive)</w:t>
             </w:r>
           </w:p>
         </w:tc>
@@ -3145,7 +3154,7 @@
               <w:rPr>
                 <w:sz w:val="18"/>
               </w:rPr>
-              <w:t>Auto (Silhouette-Adaptive)</w:t>
+              <w:t>Auto (Composite-Adaptive)</w:t>
             </w:r>
           </w:p>
         </w:tc>
@@ -3253,7 +3262,7 @@
               <w:rPr>
                 <w:sz w:val="18"/>
               </w:rPr>
-              <w:t>Auto (Silhouette-Adaptive)</w:t>
+              <w:t>Auto (Composite-Adaptive)</w:t>
             </w:r>
           </w:p>
         </w:tc>
@@ -3396,7 +3405,7 @@
               <w:rPr>
                 <w:sz w:val="18"/>
               </w:rPr>
-              <w:t>KMeans, Auto (Adaptive), MiniBatchKMeans</w:t>
+              <w:t>KMeans, MiniBatchKMeans, Gaussian Mixture (GMM)</w:t>
             </w:r>
           </w:p>
         </w:tc>

</xml_diff>

<commit_message>
Harmonize Supplementary Material section numbering (S1-S6), true Word p_t subscripts, and Table S4-S6 alignments
</commit_message>
<xml_diff>
--- a/results/submission_package/Supplementary_Material.docx
+++ b/results/submission_package/Supplementary_Material.docx
@@ -2169,20 +2169,7 @@
         <w:pStyle w:val="Heading2"/>
       </w:pPr>
       <w:r>
-        <w:t>Section S4: Standardized Statistical Inference Protocol (B = 2,000 Paired Bootstrap)</w:t>
-      </w:r>
-    </w:p>
-    <w:p>
-      <w:r>
-        <w:t>Details of the 4-strata (Y, S) paired bootstrap resampling protocol and percentile confidence interval estimation.</w:t>
-      </w:r>
-    </w:p>
-    <w:p>
-      <w:pPr>
-        <w:pStyle w:val="Heading2"/>
-      </w:pPr>
-      <w:r>
-        <w:t>Section S5: Harmonized Clinical Operating Point Benchmark (p</w:t>
+        <w:t>Section S4: Harmonized Clinical Operating Point Benchmark (p</w:t>
       </w:r>
       <w:r>
         <w:rPr>
@@ -2196,7 +2183,19 @@
     </w:p>
     <w:p>
       <w:r>
-        <w:t>Table S4 evaluates statistical fairness and clinical net benefit at the uniform decision threshold pt = 0.10.</w:t>
+        <w:t xml:space="preserve">Table S4 evaluates statistical fairness and clinical net benefit at the uniform decision threshold </w:t>
+      </w:r>
+      <w:r>
+        <w:t>p</w:t>
+      </w:r>
+      <w:r>
+        <w:rPr>
+          <w:vertAlign w:val="subscript"/>
+        </w:rPr>
+        <w:t>t</w:t>
+      </w:r>
+      <w:r>
+        <w:t xml:space="preserve"> = 0.10.</w:t>
       </w:r>
     </w:p>
     <w:tbl>
@@ -2253,7 +2252,20 @@
                 <w:b/>
                 <w:sz w:val="19"/>
               </w:rPr>
-              <w:t>Net Benefit (pt=0.10)</w:t>
+              <w:t>Net Benefit (p</w:t>
+            </w:r>
+            <w:r>
+              <w:rPr>
+                <w:b/>
+                <w:vertAlign w:val="subscript"/>
+              </w:rPr>
+              <w:t>t</w:t>
+            </w:r>
+            <w:r>
+              <w:rPr>
+                <w:b/>
+              </w:rPr>
+              <w:t xml:space="preserve"> = 0.10)</w:t>
             </w:r>
           </w:p>
         </w:tc>
@@ -2878,7 +2890,7 @@
         <w:pStyle w:val="Heading2"/>
       </w:pPr>
       <w:r>
-        <w:t>Section S6: Candidate Search Spaces (Standard N=18 &amp; Scaled N=105)</w:t>
+        <w:t>Section S5: Candidate Search Spaces (Standard N=18 &amp; Scaled N=105)</w:t>
       </w:r>
     </w:p>
     <w:p>
@@ -3506,6 +3518,19 @@
         </w:tc>
       </w:tr>
     </w:tbl>
+    <w:p>
+      <w:pPr>
+        <w:pStyle w:val="Heading2"/>
+      </w:pPr>
+      <w:r>
+        <w:t>Section S6: Standardized Statistical Inference Protocol (B = 2,000 Paired Bootstrap)</w:t>
+      </w:r>
+    </w:p>
+    <w:p>
+      <w:r>
+        <w:t>Details of the 4-strata (Y, S) paired bootstrap resampling protocol and percentile confidence interval estimation.</w:t>
+      </w:r>
+    </w:p>
     <w:sectPr>
       <w:pgSz w:w="12240" w:h="15840"/>
       <w:pgMar w:top="1440" w:right="1800" w:bottom="1440" w:left="1800" w:header="720" w:footer="720" w:gutter="0"/>

</xml_diff>